<commit_message>
Fix change order client approval merge, lien waiver signature embedding, remove mismatched notice text
</commit_message>
<xml_diff>
--- a/src/templates/CHS-Lien-Waiver-Conditional-Template.docx
+++ b/src/templates/CHS-Lien-Waiver-Conditional-Template.docx
@@ -616,22 +616,6 @@
           <w:szCs w:val="20"/>
         </w:rPr>
         <w:t xml:space="preserve"/>
-      </w:r>
-    </w:p>
-    <w:p>
-      <w:pPr>
-        <w:spacing w:after="60" w:before="60"/>
-      </w:pPr>
-      <w:r>
-        <w:rPr>
-          <w:rFonts w:ascii="Arial" w:cs="Arial" w:eastAsia="Arial" w:hAnsi="Arial"/>
-          <w:b/>
-          <w:bCs/>
-          <w:color w:val="CC0000"/>
-          <w:sz w:val="18"/>
-          <w:szCs w:val="18"/>
-        </w:rPr>
-        <w:t xml:space="preserve">NOTICE: This document waives rights unconditionally and states that you have been paid for giving up those rights. This document is enforceable against you if you sign it, even if you have not been paid. If you have not been paid, use a conditional release form.</w:t>
       </w:r>
     </w:p>
     <w:p>

</xml_diff>